<commit_message>
Add My Path link, refresh messaging, and remove unsourced metrics
- Add "My Path" nav item and hero button linking to mwill20.github.io
- Rewrite hero and About for the current Cybersecurity Engineer II role
- Remove "zero false negatives" and "100% adversarial blocking rate";
  replace with the README-backed 41 adversarial + 16 logic-bomb counts
- Correct About facts to match the resume: certification list, B.A.S.,
  First Responder dates, Director marked (Non-Profit)
- Replace published resume with the same corrections applied
- Fix contact email typo; responsive fixes for hero and stats grid
- AGENTS.md: add hard rule that biographical facts come from the resume

Co-Authored-By: Claude Fable 5.1 <noreply@anthropic.com>
</commit_message>
<xml_diff>
--- a/static/resume/M_Will_Resume.docx
+++ b/static/resume/M_Will_Resume.docx
@@ -24,26 +24,8 @@
           <w:szCs w:val="22"/>
         </w:rPr>
         <w:t xml:space="preserve"> </w:t>
-      </w:r>
-      <w:r>
-        <w:rPr>
-          <w:sz w:val="22"/>
-          <w:szCs w:val="22"/>
-        </w:rPr>
         <w:br/>
-      </w:r>
-      <w:r>
-        <w:rPr>
-          <w:sz w:val="22"/>
-          <w:szCs w:val="22"/>
-        </w:rPr>
         <w:t xml:space="preserve">Seattle, WA | 206.474.0889 </w:t>
-      </w:r>
-      <w:r>
-        <w:rPr>
-          <w:sz w:val="22"/>
-          <w:szCs w:val="22"/>
-        </w:rPr>
         <w:br/>
       </w:r>
       <w:hyperlink r:id="rId5" w:history="1">
@@ -113,12 +95,6 @@
           <w:szCs w:val="22"/>
         </w:rPr>
         <w:br/>
-      </w:r>
-      <w:r>
-        <w:rPr>
-          <w:sz w:val="22"/>
-          <w:szCs w:val="22"/>
-        </w:rPr>
         <w:br/>
       </w:r>
       <w:r>
@@ -143,83 +119,8 @@
           <w:sz w:val="22"/>
           <w:szCs w:val="22"/>
         </w:rPr>
-        <w:t>Security operations specialist and builder with 4+ years defending 60+ enterprise clients across 3,000+ endpoints in multi-region MSSP environments. Experienced across the full SOC lifecycle</w:t>
-      </w:r>
-      <w:r>
-        <w:rPr>
-          <w:sz w:val="22"/>
-          <w:szCs w:val="22"/>
-        </w:rPr>
-        <w:t xml:space="preserve">, </w:t>
-      </w:r>
-      <w:r>
-        <w:rPr>
-          <w:sz w:val="22"/>
-          <w:szCs w:val="22"/>
-        </w:rPr>
-        <w:t xml:space="preserve">Tier 2/3 triage, threat hunting, incident response, detection engineering, and customer-facing security partnerships. Built </w:t>
-      </w:r>
-      <w:r>
-        <w:rPr>
-          <w:sz w:val="22"/>
-          <w:szCs w:val="22"/>
-        </w:rPr>
-        <w:t>ThreatPrism</w:t>
-      </w:r>
-      <w:r>
-        <w:rPr>
-          <w:sz w:val="22"/>
-          <w:szCs w:val="22"/>
-        </w:rPr>
-        <w:t xml:space="preserve">, an API-driven investigation automation tool contributing to a </w:t>
-      </w:r>
-      <w:r>
-        <w:rPr>
-          <w:sz w:val="22"/>
-          <w:szCs w:val="22"/>
-        </w:rPr>
-        <w:t>48</w:t>
-      </w:r>
-      <w:r>
-        <w:rPr>
-          <w:sz w:val="22"/>
-          <w:szCs w:val="22"/>
-        </w:rPr>
-        <w:t>% MTTR reduction, and an AI DevSecOps platform validated against 57 adversarial test cases</w:t>
-      </w:r>
-      <w:r>
-        <w:rPr>
-          <w:sz w:val="22"/>
-          <w:szCs w:val="22"/>
-        </w:rPr>
-        <w:t xml:space="preserve"> with </w:t>
-      </w:r>
-      <w:r>
-        <w:rPr>
-          <w:sz w:val="22"/>
-          <w:szCs w:val="22"/>
-        </w:rPr>
-        <w:t>zero false negatives</w:t>
-      </w:r>
-      <w:r>
-        <w:rPr>
-          <w:sz w:val="22"/>
-          <w:szCs w:val="22"/>
-        </w:rPr>
-        <w:t>. I convert threat telemetry into actionable detections, investigations into clear reporting, and security complexity into customer confidence.</w:t>
-      </w:r>
-      <w:r>
-        <w:rPr>
-          <w:sz w:val="22"/>
-          <w:szCs w:val="22"/>
-        </w:rPr>
+        <w:t xml:space="preserve">Cybersecurity engineer and builder with 5 years in security operations, now securing a unique healthcare environment at SEARHC after defending 60+ enterprise clients across 3,000+ endpoints in international MSSP environments. Experienced across the full SOC lifecycle, Tier 2/3 triage, threat hunting, incident response, detection engineering, vulnerability management, customer-facing and vendor security partnerships. Built ThreatPrism, an API-driven investigation automation tool contributing to a 48% MTTR reduction in production, and an AI DevSecOps platform tested against 57 adversarial and logic-bomb cases. I convert threat telemetry into actionable detections, investigations into clear reporting and accurate response, transforming security complexity into engineered solutions. Current focus: Experimentation and Research in AI Security, Agentic security, MCP, developments in AI security as they evolve.</w:t>
         <w:br/>
-      </w:r>
-      <w:r>
-        <w:rPr>
-          <w:sz w:val="22"/>
-          <w:szCs w:val="22"/>
-        </w:rPr>
         <w:br/>
       </w:r>
       <w:r>
@@ -277,7 +178,7 @@
           <w:sz w:val="22"/>
           <w:szCs w:val="22"/>
         </w:rPr>
-        <w:t xml:space="preserve"> Proactive threat hunting, TTP/IOC analysis, MITRE ATT&amp;CK mapping, IR lifecycle (scoping, containment, eradication, recovery), evidence preservation, endpoint forensics</w:t>
+        <w:t xml:space="preserve"> Proactive threat hunting, TTP/IOC analysis, MITRE ATT&amp;CK mapping, IR lifecycle (scoping, containment, eradication, recovery), evidence preservation, endpoint investigation and forensics</w:t>
       </w:r>
     </w:p>
     <w:p>
@@ -301,14 +202,96 @@
           <w:sz w:val="22"/>
           <w:szCs w:val="22"/>
         </w:rPr>
-        <w:t xml:space="preserve"> EDR, SIEM, SOAR, XDR, event triage, alert prioritization, cross-region SOC operations</w:t>
-      </w:r>
-      <w:r>
-        <w:rPr>
-          <w:sz w:val="22"/>
-          <w:szCs w:val="22"/>
-        </w:rPr>
-        <w:t>.</w:t>
+        <w:t xml:space="preserve"> EDR, SIEM, SOAR, XDR, event triage, alert prioritization, cross-region SOC operations. </w:t>
+      </w:r>
+      <w:r>
+        <w:rPr>
+          <w:b/>
+          <w:bCs/>
+          <w:sz w:val="22"/>
+          <w:szCs w:val="22"/>
+        </w:rPr>
+        <w:t>Swimlane</w:t>
+      </w:r>
+      <w:r>
+        <w:rPr>
+          <w:sz w:val="22"/>
+          <w:szCs w:val="22"/>
+        </w:rPr>
+        <w:t xml:space="preserve">: SOAR | </w:t>
+      </w:r>
+      <w:r>
+        <w:rPr>
+          <w:b/>
+          <w:bCs/>
+          <w:sz w:val="22"/>
+          <w:szCs w:val="22"/>
+        </w:rPr>
+        <w:t>GreyMatter</w:t>
+      </w:r>
+      <w:r>
+        <w:rPr>
+          <w:sz w:val="22"/>
+          <w:szCs w:val="22"/>
+        </w:rPr>
+        <w:t xml:space="preserve">: SOAR | </w:t>
+      </w:r>
+      <w:r>
+        <w:rPr>
+          <w:b/>
+          <w:bCs/>
+          <w:sz w:val="22"/>
+          <w:szCs w:val="22"/>
+        </w:rPr>
+        <w:t>Microsoft</w:t>
+      </w:r>
+      <w:r>
+        <w:rPr>
+          <w:sz w:val="22"/>
+          <w:szCs w:val="22"/>
+        </w:rPr>
+        <w:t xml:space="preserve">: ADX, Sentinel, Defender, Managed Id | </w:t>
+      </w:r>
+      <w:r>
+        <w:rPr>
+          <w:b/>
+          <w:bCs/>
+          <w:sz w:val="22"/>
+          <w:szCs w:val="22"/>
+        </w:rPr>
+        <w:t>Forti</w:t>
+      </w:r>
+      <w:r>
+        <w:rPr>
+          <w:sz w:val="22"/>
+          <w:szCs w:val="22"/>
+        </w:rPr>
+        <w:t xml:space="preserve">: EDR, SIEM | </w:t>
+      </w:r>
+      <w:r>
+        <w:rPr>
+          <w:b/>
+          <w:bCs/>
+          <w:sz w:val="22"/>
+          <w:szCs w:val="22"/>
+        </w:rPr>
+        <w:t>Wazuh</w:t>
+      </w:r>
+      <w:r>
+        <w:rPr>
+          <w:sz w:val="22"/>
+          <w:szCs w:val="22"/>
+        </w:rPr>
+        <w:t xml:space="preserve">: EDR, SIEM | </w:t>
+      </w:r>
+      <w:r>
+        <w:rPr>
+          <w:b/>
+          <w:bCs/>
+          <w:sz w:val="22"/>
+          <w:szCs w:val="22"/>
+        </w:rPr>
+        <w:t>Google</w:t>
       </w:r>
       <w:r>
         <w:rPr>
@@ -324,102 +307,46 @@
           <w:sz w:val="22"/>
           <w:szCs w:val="22"/>
         </w:rPr>
-        <w:t>Microsoft</w:t>
-      </w:r>
-      <w:r>
-        <w:rPr>
-          <w:sz w:val="22"/>
-          <w:szCs w:val="22"/>
-        </w:rPr>
-        <w:t>:</w:t>
-      </w:r>
-      <w:r>
-        <w:rPr>
-          <w:sz w:val="22"/>
-          <w:szCs w:val="22"/>
-        </w:rPr>
-        <w:t xml:space="preserve"> </w:t>
-      </w:r>
-      <w:r>
-        <w:rPr>
-          <w:sz w:val="22"/>
-          <w:szCs w:val="22"/>
-        </w:rPr>
-        <w:t xml:space="preserve">ADX, </w:t>
-      </w:r>
-      <w:r>
-        <w:rPr>
-          <w:sz w:val="22"/>
-          <w:szCs w:val="22"/>
-        </w:rPr>
-        <w:t>Sentinel</w:t>
-      </w:r>
-      <w:r>
-        <w:rPr>
-          <w:sz w:val="22"/>
-          <w:szCs w:val="22"/>
-        </w:rPr>
-        <w:t xml:space="preserve">, </w:t>
-      </w:r>
-      <w:r>
-        <w:rPr>
-          <w:sz w:val="22"/>
-          <w:szCs w:val="22"/>
-        </w:rPr>
-        <w:t xml:space="preserve">Defender, </w:t>
-      </w:r>
-      <w:r>
-        <w:rPr>
-          <w:sz w:val="22"/>
-          <w:szCs w:val="22"/>
-        </w:rPr>
-        <w:t>Managed Id</w:t>
-      </w:r>
-      <w:r>
-        <w:rPr>
-          <w:sz w:val="22"/>
-          <w:szCs w:val="22"/>
-        </w:rPr>
-        <w:t xml:space="preserve"> | </w:t>
-      </w:r>
-      <w:r>
-        <w:rPr>
-          <w:b/>
-          <w:bCs/>
-          <w:sz w:val="22"/>
-          <w:szCs w:val="22"/>
-        </w:rPr>
-        <w:t>Forti</w:t>
-      </w:r>
-      <w:r>
-        <w:rPr>
-          <w:sz w:val="22"/>
-          <w:szCs w:val="22"/>
-        </w:rPr>
-        <w:t>: EDR, SIEM |</w:t>
-      </w:r>
-      <w:r>
-        <w:rPr>
-          <w:sz w:val="22"/>
-          <w:szCs w:val="22"/>
-        </w:rPr>
-        <w:t xml:space="preserve"> </w:t>
-      </w:r>
-      <w:r>
-        <w:rPr>
-          <w:b/>
-          <w:bCs/>
-          <w:sz w:val="22"/>
-          <w:szCs w:val="22"/>
-        </w:rPr>
-        <w:t>Wazuh</w:t>
-      </w:r>
-      <w:r>
-        <w:rPr>
-          <w:sz w:val="22"/>
-          <w:szCs w:val="22"/>
-        </w:rPr>
-        <w:t>: EDR, SIEM</w:t>
+        <w:t>SecOps</w:t>
+      </w:r>
+      <w:r>
+        <w:rPr>
+          <w:sz w:val="22"/>
+          <w:szCs w:val="22"/>
+        </w:rPr>
+        <w:t xml:space="preserve">: SIEM | </w:t>
+      </w:r>
+      <w:r>
+        <w:rPr>
+          <w:b/>
+          <w:bCs/>
+          <w:sz w:val="22"/>
+          <w:szCs w:val="22"/>
+        </w:rPr>
+        <w:t>SentinelOne</w:t>
+      </w:r>
+      <w:r>
+        <w:rPr>
+          <w:sz w:val="22"/>
+          <w:szCs w:val="22"/>
+        </w:rPr>
+        <w:t xml:space="preserve">: EDR/XDR, </w:t>
+      </w:r>
+      <w:r>
+        <w:rPr>
+          <w:b/>
+          <w:bCs/>
+          <w:sz w:val="22"/>
+          <w:szCs w:val="22"/>
+        </w:rPr>
+        <w:t>TrendMicro</w:t>
+      </w:r>
+      <w:r>
+        <w:rPr>
+          <w:sz w:val="22"/>
+          <w:szCs w:val="22"/>
+        </w:rPr>
+        <w:t xml:space="preserve">: XDR | Proofpoint: Email Security, ZenGuide Phish simulation | Palo Alto: Firewall</w:t>
       </w:r>
     </w:p>
     <w:p>
@@ -460,6 +387,30 @@
           <w:sz w:val="22"/>
           <w:szCs w:val="22"/>
         </w:rPr>
+        <w:t>Vulnerability &amp; Risk Management:</w:t>
+      </w:r>
+      <w:r>
+        <w:rPr>
+          <w:sz w:val="22"/>
+          <w:szCs w:val="22"/>
+        </w:rPr>
+        <w:t xml:space="preserve"> Automated pentesting and vulnerability scanning (Pentera), remediation program management, IAM and privileged access, vendor risk (SRAs), AI risk assessment</w:t>
+      </w:r>
+    </w:p>
+    <w:p>
+      <w:pPr>
+        <w:rPr>
+          <w:sz w:val="22"/>
+          <w:szCs w:val="22"/>
+        </w:rPr>
+      </w:pPr>
+      <w:r>
+        <w:rPr>
+          <w:b/>
+          <w:bCs/>
+          <w:sz w:val="22"/>
+          <w:szCs w:val="22"/>
+        </w:rPr>
         <w:t>Builder:</w:t>
       </w:r>
       <w:r>
@@ -467,21 +418,7 @@
           <w:sz w:val="22"/>
           <w:szCs w:val="22"/>
         </w:rPr>
-        <w:t xml:space="preserve"> Python, REST APIs, Postman, LLM integration, Git/GitHub, Docker, </w:t>
-      </w:r>
-      <w:r>
-        <w:rPr>
-          <w:sz w:val="22"/>
-          <w:szCs w:val="22"/>
-        </w:rPr>
-        <w:t>A</w:t>
-      </w:r>
-      <w:r>
-        <w:rPr>
-          <w:sz w:val="22"/>
-          <w:szCs w:val="22"/>
-        </w:rPr>
-        <w:t>utomation workflows</w:t>
+        <w:t xml:space="preserve"> Python, PowerShell, Bash, SQL, YARA-L 2.0, REST APIs, Postman, LLM integration, Git/GitHub, Docker, Automation workflows, MCP, Claude Code, Codex, Gemini, Copilot</w:t>
       </w:r>
     </w:p>
     <w:p>
@@ -505,89 +442,33 @@
           <w:sz w:val="22"/>
           <w:szCs w:val="22"/>
         </w:rPr>
-        <w:t xml:space="preserve">: NIST, </w:t>
-      </w:r>
-      <w:r>
-        <w:rPr>
-          <w:sz w:val="22"/>
-          <w:szCs w:val="22"/>
-        </w:rPr>
-        <w:t>ISO</w:t>
-      </w:r>
-      <w:r>
-        <w:rPr>
-          <w:sz w:val="22"/>
-          <w:szCs w:val="22"/>
-        </w:rPr>
-        <w:t>,</w:t>
-      </w:r>
-      <w:r>
-        <w:rPr>
-          <w:sz w:val="22"/>
-          <w:szCs w:val="22"/>
-        </w:rPr>
-        <w:t xml:space="preserve"> </w:t>
-      </w:r>
-      <w:r>
-        <w:rPr>
-          <w:sz w:val="22"/>
-          <w:szCs w:val="22"/>
-        </w:rPr>
-        <w:t>MITRE</w:t>
-      </w:r>
-      <w:r>
-        <w:rPr>
-          <w:sz w:val="22"/>
-          <w:szCs w:val="22"/>
-        </w:rPr>
-        <w:t xml:space="preserve">, </w:t>
-      </w:r>
-      <w:r>
-        <w:rPr>
-          <w:sz w:val="22"/>
-          <w:szCs w:val="22"/>
-        </w:rPr>
-        <w:t xml:space="preserve">OWASP, </w:t>
-      </w:r>
-      <w:r>
-        <w:rPr>
-          <w:sz w:val="22"/>
-          <w:szCs w:val="22"/>
-        </w:rPr>
-        <w:t>PCI-DSS, GDPR</w:t>
-      </w:r>
-      <w:r>
-        <w:rPr>
-          <w:sz w:val="22"/>
-          <w:szCs w:val="22"/>
-        </w:rPr>
-        <w:t>, HIP</w:t>
-      </w:r>
-      <w:r>
-        <w:rPr>
-          <w:sz w:val="22"/>
-          <w:szCs w:val="22"/>
-        </w:rPr>
-        <w:t>A</w:t>
-      </w:r>
-      <w:r>
-        <w:rPr>
-          <w:sz w:val="22"/>
-          <w:szCs w:val="22"/>
-        </w:rPr>
-        <w:t>A</w:t>
-      </w:r>
-      <w:r>
-        <w:rPr>
-          <w:sz w:val="22"/>
-          <w:szCs w:val="22"/>
-        </w:rPr>
+        <w:t>: NIST, ISO 27001, MITRE, OWASP, PCI-DSS, GDPR, HIPAA, SOC 2</w:t>
         <w:br/>
       </w:r>
     </w:p>
     <w:p>
       <w:pPr>
         <w:rPr>
+          <w:b/>
+          <w:bCs/>
+          <w:sz w:val="22"/>
+          <w:szCs w:val="22"/>
+        </w:rPr>
+      </w:pPr>
+    </w:p>
+    <w:p>
+      <w:pPr>
+        <w:rPr>
+          <w:b/>
+          <w:bCs/>
+          <w:sz w:val="22"/>
+          <w:szCs w:val="22"/>
+        </w:rPr>
+      </w:pPr>
+    </w:p>
+    <w:p>
+      <w:pPr>
+        <w:rPr>
           <w:sz w:val="22"/>
           <w:szCs w:val="22"/>
         </w:rPr>
@@ -618,114 +499,62 @@
           <w:sz w:val="22"/>
           <w:szCs w:val="22"/>
         </w:rPr>
-        <w:t>ThreatPrism</w:t>
-      </w:r>
-      <w:r>
-        <w:rPr>
-          <w:b/>
-          <w:bCs/>
-          <w:sz w:val="22"/>
-          <w:szCs w:val="22"/>
-        </w:rPr>
-        <w:t xml:space="preserve"> | SOC Automation &amp; Detection Pipeline</w:t>
-      </w:r>
-      <w:r>
-        <w:rPr>
-          <w:sz w:val="22"/>
-          <w:szCs w:val="22"/>
-        </w:rPr>
-        <w:t xml:space="preserve">: </w:t>
-      </w:r>
-      <w:r>
-        <w:rPr>
-          <w:sz w:val="22"/>
-          <w:szCs w:val="22"/>
-        </w:rPr>
-        <w:t xml:space="preserve">Built an API-driven pipeline that pulls telemetry, extracts IOCs, maps TTPs to MITRE ATT&amp;CK, and generates structured analyst context to accelerate detection and investigation. Contributed to a </w:t>
-      </w:r>
-      <w:r>
-        <w:rPr>
-          <w:sz w:val="22"/>
-          <w:szCs w:val="22"/>
-        </w:rPr>
-        <w:t>48</w:t>
-      </w:r>
-      <w:r>
-        <w:rPr>
-          <w:sz w:val="22"/>
-          <w:szCs w:val="22"/>
-        </w:rPr>
-        <w:t xml:space="preserve">% MTTR reduction </w:t>
-      </w:r>
-      <w:r>
-        <w:rPr>
-          <w:sz w:val="22"/>
-          <w:szCs w:val="22"/>
-        </w:rPr>
-        <w:t>affecting</w:t>
-      </w:r>
-      <w:r>
-        <w:rPr>
-          <w:sz w:val="22"/>
-          <w:szCs w:val="22"/>
-        </w:rPr>
-        <w:t xml:space="preserve"> 60+ enterprise clients via Swimlane SOAR integration.</w:t>
-      </w:r>
-    </w:p>
-    <w:p>
-      <w:pPr>
-        <w:rPr>
-          <w:sz w:val="22"/>
-          <w:szCs w:val="22"/>
-        </w:rPr>
-      </w:pPr>
-      <w:r>
-        <w:rPr>
-          <w:b/>
-          <w:bCs/>
-          <w:sz w:val="22"/>
-          <w:szCs w:val="22"/>
-        </w:rPr>
-        <w:t>AI DevSecOps Platform | Adversarial Detection &amp; Guardrails</w:t>
-      </w:r>
-      <w:r>
-        <w:rPr>
-          <w:sz w:val="22"/>
-          <w:szCs w:val="22"/>
-        </w:rPr>
-        <w:t xml:space="preserve">: </w:t>
-      </w:r>
-      <w:r>
-        <w:rPr>
-          <w:sz w:val="22"/>
-          <w:szCs w:val="22"/>
-        </w:rPr>
-        <w:t>Engineered a secure code analysis platform using deterministic controls and LLM-assisted reasoning to detect unsafe patterns in AI-generated code. Validated detection logic across 57 adversarial test cases with zero false negatives.</w:t>
-      </w:r>
-    </w:p>
-    <w:p>
-      <w:pPr>
-        <w:rPr>
-          <w:sz w:val="22"/>
-          <w:szCs w:val="22"/>
-        </w:rPr>
-      </w:pPr>
-    </w:p>
-    <w:p>
-      <w:pPr>
-        <w:rPr>
-          <w:sz w:val="22"/>
-          <w:szCs w:val="22"/>
-        </w:rPr>
-      </w:pPr>
-      <w:r>
-        <w:rPr>
-          <w:b/>
-          <w:bCs/>
-          <w:sz w:val="22"/>
-          <w:szCs w:val="22"/>
-        </w:rPr>
-        <w:lastRenderedPageBreak/>
+        <w:t xml:space="preserve">ThreatPrism | SOC Automation &amp; Detection Pipeline</w:t>
+      </w:r>
+      <w:r>
+        <w:rPr>
+          <w:sz w:val="22"/>
+          <w:szCs w:val="22"/>
+        </w:rPr>
+        <w:t>: Built an API-driven pipeline that pulls telemetry, extracts IOCs, maps TTPs to MITRE ATT&amp;CK, and generates structured analyst context to accelerate detection and investigation. Contributed to a 48% MTTR reduction affecting 60+ enterprise clients via Swimlane SOAR integration.</w:t>
+      </w:r>
+    </w:p>
+    <w:p>
+      <w:pPr>
+        <w:rPr>
+          <w:sz w:val="22"/>
+          <w:szCs w:val="22"/>
+        </w:rPr>
+      </w:pPr>
+      <w:r>
+        <w:rPr>
+          <w:b/>
+          <w:bCs/>
+          <w:sz w:val="22"/>
+          <w:szCs w:val="22"/>
+        </w:rPr>
+        <w:t xml:space="preserve">AI DevSecOps Platform | Adversarial Detection &amp; Guardrails</w:t>
+      </w:r>
+      <w:r>
+        <w:rPr>
+          <w:sz w:val="22"/>
+          <w:szCs w:val="22"/>
+        </w:rPr>
+        <w:t>: Engineered a secure code analysis platform using deterministic controls and LLM-assisted reasoning to detect unsafe patterns in AI-generated code. Tested detection logic against 57 adversarial and logic-bomb cases.</w:t>
+      </w:r>
+    </w:p>
+    <w:p>
+      <w:pPr>
+        <w:rPr>
+          <w:sz w:val="22"/>
+          <w:szCs w:val="22"/>
+        </w:rPr>
+      </w:pPr>
+    </w:p>
+    <w:p>
+      <w:pPr>
+        <w:rPr>
+          <w:sz w:val="22"/>
+          <w:szCs w:val="22"/>
+        </w:rPr>
+      </w:pPr>
+      <w:r>
+        <w:rPr>
+          <w:b/>
+          <w:bCs/>
+          <w:sz w:val="22"/>
+          <w:szCs w:val="22"/>
+        </w:rPr>
         <w:t>PROFESSIONAL EXPERIENCE</w:t>
       </w:r>
       <w:r>
@@ -742,21 +571,14 @@
           <w:sz w:val="22"/>
           <w:szCs w:val="22"/>
         </w:rPr>
-        <w:t xml:space="preserve">Cybersecurity Analyst II </w:t>
-      </w:r>
-      <w:r>
-        <w:rPr>
-          <w:sz w:val="22"/>
-          <w:szCs w:val="22"/>
-        </w:rPr>
-        <w:t xml:space="preserve">| 11:11 Systems | Feb 2024 – </w:t>
-      </w:r>
-      <w:r>
-        <w:rPr>
-          <w:sz w:val="22"/>
-          <w:szCs w:val="22"/>
-        </w:rPr>
-        <w:t>Apr 2026</w:t>
+        <w:t xml:space="preserve">Cybersecurity Engineer II </w:t>
+      </w:r>
+      <w:r>
+        <w:rPr>
+          <w:sz w:val="22"/>
+          <w:szCs w:val="22"/>
+        </w:rPr>
+        <w:t>| SEARHC | Jun 2026 – Present</w:t>
       </w:r>
     </w:p>
     <w:p>
@@ -776,7 +598,7 @@
           <w:sz w:val="22"/>
           <w:szCs w:val="22"/>
         </w:rPr>
-        <w:t>Manage endpoint security operations across 3,000+ systems in US, APAC, and EU regions, triaging 300+ events weekly across 60+ enterprise MSSP clients.</w:t>
+        <w:t xml:space="preserve">Developed and rolled out a vulnerability management program for testing and remediation using Pentera and Pentera Resolve; drive fixes across network, infrastructure, application, and MEDITECH teams.</w:t>
       </w:r>
     </w:p>
     <w:p>
@@ -796,49 +618,7 @@
           <w:sz w:val="22"/>
           <w:szCs w:val="22"/>
         </w:rPr>
-        <w:t xml:space="preserve">Engineered and operationalized </w:t>
-      </w:r>
-      <w:r>
-        <w:rPr>
-          <w:sz w:val="22"/>
-          <w:szCs w:val="22"/>
-        </w:rPr>
-        <w:t>ThreatPrism</w:t>
-      </w:r>
-      <w:r>
-        <w:rPr>
-          <w:sz w:val="22"/>
-          <w:szCs w:val="22"/>
-        </w:rPr>
-        <w:t xml:space="preserve"> within Swimlane SOAR, automating IOC extraction and analyst context generation</w:t>
-      </w:r>
-      <w:r>
-        <w:rPr>
-          <w:sz w:val="22"/>
-          <w:szCs w:val="22"/>
-        </w:rPr>
-        <w:t>,</w:t>
-      </w:r>
-      <w:r>
-        <w:rPr>
-          <w:sz w:val="22"/>
-          <w:szCs w:val="22"/>
-        </w:rPr>
-        <w:t xml:space="preserve"> contributing to a </w:t>
-      </w:r>
-      <w:r>
-        <w:rPr>
-          <w:sz w:val="22"/>
-          <w:szCs w:val="22"/>
-        </w:rPr>
-        <w:t>48</w:t>
-      </w:r>
-      <w:r>
-        <w:rPr>
-          <w:sz w:val="22"/>
-          <w:szCs w:val="22"/>
-        </w:rPr>
-        <w:t>% reduction in MTTR.</w:t>
+        <w:t xml:space="preserve">Investigate and respond to escalated threats from outsourced SOC ReliaQuest, leading containment and remediation across GreyMatter SOAR, Google SecOps SIEM, SentinelOne EDR, Defender, Exchange, Entra ID/Active Directory, and Palo Alto Panorama, with OSINT enrichment.</w:t>
       </w:r>
     </w:p>
     <w:p>
@@ -858,7 +638,7 @@
           <w:sz w:val="22"/>
           <w:szCs w:val="22"/>
         </w:rPr>
-        <w:t>Conduct proactive threat hunting across client environments using behavioral analysis and IOC correlation, identifying threats that bypassed automated detection layers.</w:t>
+        <w:t>Lead the IAM program, cleaning up and maturing access and privilege management across a healthcare environment.</w:t>
       </w:r>
     </w:p>
     <w:p>
@@ -878,7 +658,7 @@
           <w:sz w:val="22"/>
           <w:szCs w:val="22"/>
         </w:rPr>
-        <w:t>Develop, tune, and validate detection logic across EDR and SIEM platforms; reduce false positive rates and improve signal fidelity across multi-tenant environments.</w:t>
+        <w:t xml:space="preserve">Administer Proofpoint email security and Zenguide phishing testing; manage GRC in Drata, with Lansweeper and Freshservice for asset visibility and ticketed remediation.</w:t>
       </w:r>
     </w:p>
     <w:p>
@@ -898,7 +678,7 @@
           <w:sz w:val="22"/>
           <w:szCs w:val="22"/>
         </w:rPr>
-        <w:t>Lead 30+ incident response investigations monthly; deliver structured containment guidance, evidence preservation coordination, and executive-ready reporting.</w:t>
+        <w:t>Conduct Software Risk Assessments (SRAs) using OSINT and vendor analysis; lead AI risk assessment and adoption for the organization.</w:t>
       </w:r>
     </w:p>
     <w:p>
@@ -918,38 +698,169 @@
           <w:sz w:val="22"/>
           <w:szCs w:val="22"/>
         </w:rPr>
-        <w:t>Serve as technical partner for 25+ customer requests weekly</w:t>
-      </w:r>
-      <w:r>
-        <w:rPr>
-          <w:sz w:val="22"/>
-          <w:szCs w:val="22"/>
-        </w:rPr>
-        <w:t>:</w:t>
-      </w:r>
-      <w:r>
-        <w:rPr>
-          <w:sz w:val="22"/>
-          <w:szCs w:val="22"/>
-        </w:rPr>
-        <w:t xml:space="preserve"> EDR exceptions, telemetry gaps, configuration tuning, and remediation coordination across 14 onboarded enterprise environments.</w:t>
-      </w:r>
-    </w:p>
-    <w:p>
-      <w:pPr>
-        <w:rPr>
-          <w:sz w:val="22"/>
-          <w:szCs w:val="22"/>
-        </w:rPr>
-      </w:pPr>
-      <w:r>
-        <w:rPr>
-          <w:b/>
-          <w:bCs/>
-          <w:sz w:val="22"/>
-          <w:szCs w:val="22"/>
-        </w:rPr>
-        <w:t xml:space="preserve">Director of Cybersecurity </w:t>
+        <w:t>Resolve security issues and automate repeatable tasks using AI-assisted analysis, API testing, and scripting (Python, PowerShell, Bash, SQL, KQL, YARA-L 2.0), aligned to NIST, ISO 27001, HIPAA, and SOC 2.</w:t>
+      </w:r>
+    </w:p>
+    <w:p>
+      <w:pPr>
+        <w:rPr>
+          <w:sz w:val="22"/>
+          <w:szCs w:val="22"/>
+        </w:rPr>
+      </w:pPr>
+      <w:r>
+        <w:rPr>
+          <w:b/>
+          <w:bCs/>
+          <w:sz w:val="22"/>
+          <w:szCs w:val="22"/>
+        </w:rPr>
+        <w:t xml:space="preserve">Cybersecurity Analyst II </w:t>
+      </w:r>
+      <w:r>
+        <w:rPr>
+          <w:sz w:val="22"/>
+          <w:szCs w:val="22"/>
+        </w:rPr>
+        <w:t>| 11:11 Systems | Feb 2024 – Apr 2026</w:t>
+      </w:r>
+    </w:p>
+    <w:p>
+      <w:pPr>
+        <w:pStyle w:val="ListParagraph"/>
+        <w:numPr>
+          <w:ilvl w:val="0"/>
+          <w:numId w:val="4"/>
+        </w:numPr>
+        <w:rPr>
+          <w:sz w:val="22"/>
+          <w:szCs w:val="22"/>
+        </w:rPr>
+      </w:pPr>
+      <w:r>
+        <w:rPr>
+          <w:sz w:val="22"/>
+          <w:szCs w:val="22"/>
+        </w:rPr>
+        <w:t>Manage endpoint security operations across 3,000+ systems in US, APAC, and EU regions, triaging 300+ events weekly across 60+ enterprise MSSP clients.</w:t>
+      </w:r>
+    </w:p>
+    <w:p>
+      <w:pPr>
+        <w:pStyle w:val="ListParagraph"/>
+        <w:numPr>
+          <w:ilvl w:val="0"/>
+          <w:numId w:val="4"/>
+        </w:numPr>
+        <w:rPr>
+          <w:sz w:val="22"/>
+          <w:szCs w:val="22"/>
+        </w:rPr>
+      </w:pPr>
+      <w:r>
+        <w:rPr>
+          <w:sz w:val="22"/>
+          <w:szCs w:val="22"/>
+        </w:rPr>
+        <w:t xml:space="preserve">Engineered and operationalized ThreatPrism within Swimlane SOAR, automating IOC extraction and analyst context generation, contributing to a 48% reduction in MTTR.</w:t>
+      </w:r>
+    </w:p>
+    <w:p>
+      <w:pPr>
+        <w:pStyle w:val="ListParagraph"/>
+        <w:numPr>
+          <w:ilvl w:val="0"/>
+          <w:numId w:val="4"/>
+        </w:numPr>
+        <w:rPr>
+          <w:sz w:val="22"/>
+          <w:szCs w:val="22"/>
+        </w:rPr>
+      </w:pPr>
+      <w:r>
+        <w:rPr>
+          <w:sz w:val="22"/>
+          <w:szCs w:val="22"/>
+        </w:rPr>
+        <w:t>Conduct proactive threat hunting across client environments using behavioral analysis and IOC correlation, identifying threats that bypassed automated detection layers.</w:t>
+      </w:r>
+    </w:p>
+    <w:p>
+      <w:pPr>
+        <w:pStyle w:val="ListParagraph"/>
+        <w:numPr>
+          <w:ilvl w:val="0"/>
+          <w:numId w:val="4"/>
+        </w:numPr>
+        <w:rPr>
+          <w:sz w:val="22"/>
+          <w:szCs w:val="22"/>
+        </w:rPr>
+      </w:pPr>
+      <w:r>
+        <w:rPr>
+          <w:sz w:val="22"/>
+          <w:szCs w:val="22"/>
+        </w:rPr>
+        <w:lastRenderedPageBreak/>
+        <w:t>Develop, tune, and validate detection logic across EDR and SIEM platforms; reduce false positive rates and improve signal fidelity across multi-tenant environments.</w:t>
+      </w:r>
+    </w:p>
+    <w:p>
+      <w:pPr>
+        <w:pStyle w:val="ListParagraph"/>
+        <w:numPr>
+          <w:ilvl w:val="0"/>
+          <w:numId w:val="4"/>
+        </w:numPr>
+        <w:rPr>
+          <w:sz w:val="22"/>
+          <w:szCs w:val="22"/>
+        </w:rPr>
+      </w:pPr>
+      <w:r>
+        <w:rPr>
+          <w:sz w:val="22"/>
+          <w:szCs w:val="22"/>
+        </w:rPr>
+        <w:t>Lead 30+ incident response investigations monthly; deliver structured containment guidance, evidence preservation coordination, and executive-ready reporting.</w:t>
+      </w:r>
+    </w:p>
+    <w:p>
+      <w:pPr>
+        <w:pStyle w:val="ListParagraph"/>
+        <w:numPr>
+          <w:ilvl w:val="0"/>
+          <w:numId w:val="4"/>
+        </w:numPr>
+        <w:rPr>
+          <w:sz w:val="22"/>
+          <w:szCs w:val="22"/>
+        </w:rPr>
+      </w:pPr>
+      <w:r>
+        <w:rPr>
+          <w:sz w:val="22"/>
+          <w:szCs w:val="22"/>
+        </w:rPr>
+        <w:t>Serve as technical partner for 25+ customer requests weekly: EDR exceptions, telemetry gaps, configuration tuning, and remediation coordination across 14 onboarded enterprise environments.</w:t>
+      </w:r>
+    </w:p>
+    <w:p>
+      <w:pPr>
+        <w:rPr>
+          <w:sz w:val="22"/>
+          <w:szCs w:val="22"/>
+        </w:rPr>
+      </w:pPr>
+      <w:r>
+        <w:rPr>
+          <w:b/>
+          <w:bCs/>
+          <w:sz w:val="22"/>
+          <w:szCs w:val="22"/>
+        </w:rPr>
+        <w:t xml:space="preserve">Director of Cybersecurity (Non-Profit) </w:t>
       </w:r>
       <w:r>
         <w:rPr>
@@ -976,7 +887,7 @@
           <w:sz w:val="22"/>
           <w:szCs w:val="22"/>
         </w:rPr>
-        <w:t>Architected a production SOC from the ground up, integrating BitDefender, Wazuh, Splunk, TheHive, and Action1 for detection, monitoring, and response operations.</w:t>
+        <w:t xml:space="preserve">Architected a production SOC from the ground up, integrating BitDefender, Wazuh, Splunk, TheHive, and Action1 for detection, monitoring, and response operations.</w:t>
       </w:r>
     </w:p>
     <w:p>
@@ -996,7 +907,7 @@
           <w:sz w:val="22"/>
           <w:szCs w:val="22"/>
         </w:rPr>
-        <w:t>Led a 30+ member team spanning SOC operations, detection engineering, incident response, and GRC.</w:t>
+        <w:t xml:space="preserve">Led a 30+ member team spanning SOC operations, cybersecurity engineering, incident response, and insider threat.</w:t>
       </w:r>
     </w:p>
     <w:p>
@@ -1016,21 +927,7 @@
           <w:sz w:val="22"/>
           <w:szCs w:val="22"/>
         </w:rPr>
-        <w:t xml:space="preserve">Developed threat hunting playbooks, detection runbooks, and IR procedures that improved team repeatability and reduced </w:t>
-      </w:r>
-      <w:r>
-        <w:rPr>
-          <w:sz w:val="22"/>
-          <w:szCs w:val="22"/>
-        </w:rPr>
-        <w:t>MTTR</w:t>
-      </w:r>
-      <w:r>
-        <w:rPr>
-          <w:sz w:val="22"/>
-          <w:szCs w:val="22"/>
-        </w:rPr>
-        <w:t>.</w:t>
+        <w:t xml:space="preserve">Developed SOPs, playbooks, detection runbooks, and IR procedures that improved team repeatability and reduced MTTR.</w:t>
       </w:r>
     </w:p>
     <w:p>
@@ -1054,21 +951,7 @@
           <w:sz w:val="22"/>
           <w:szCs w:val="22"/>
         </w:rPr>
-        <w:t xml:space="preserve"> (Technology Operations) | Co-Lead </w:t>
-      </w:r>
-      <w:r>
-        <w:rPr>
-          <w:sz w:val="22"/>
-          <w:szCs w:val="22"/>
-        </w:rPr>
-        <w:t xml:space="preserve">PDA </w:t>
-      </w:r>
-      <w:r>
-        <w:rPr>
-          <w:sz w:val="22"/>
-          <w:szCs w:val="22"/>
-        </w:rPr>
-        <w:t>| Feb 2020 – Feb 2021</w:t>
+        <w:t xml:space="preserve"> (Technology Operations) | Co-Lead PDA | April 2020 – Jan 2021</w:t>
       </w:r>
     </w:p>
     <w:p>
@@ -1087,7 +970,7 @@
           <w:sz w:val="22"/>
           <w:szCs w:val="22"/>
         </w:rPr>
-        <w:t>Secured rapid IT operations for a COVID-19 response environment; managed endpoint provisioning, authentication controls, and collaboration tooling for distributed teams handling HIPAA/PII data.</w:t>
+        <w:t xml:space="preserve">Secured rapid IT operations for a COVID-19 response environment; managed endpoint provisioning, authentication controls, email security, IAM setup and life cycle collaboration tooling for distributed teams handling HIPAA/PII data.</w:t>
       </w:r>
     </w:p>
     <w:p>
@@ -1121,6 +1004,23 @@
           <w:sz w:val="22"/>
           <w:szCs w:val="22"/>
         </w:rPr>
+        <w:t xml:space="preserve">Postgraduate, Agentic AI Program: </w:t>
+      </w:r>
+      <w:r>
+        <w:rPr>
+          <w:sz w:val="22"/>
+          <w:szCs w:val="22"/>
+        </w:rPr>
+        <w:t xml:space="preserve">Western State University, California | Present </w:t>
+      </w:r>
+      <w:r>
+        <w:rPr>
+          <w:b/>
+          <w:bCs/>
+          <w:sz w:val="22"/>
+          <w:szCs w:val="22"/>
+        </w:rPr>
+        <w:br/>
         <w:t>Postgraduate, AI &amp; ML Engineering</w:t>
       </w:r>
       <w:r>
@@ -1128,13 +1028,7 @@
           <w:sz w:val="22"/>
           <w:szCs w:val="22"/>
         </w:rPr>
-        <w:t xml:space="preserve"> — University of Texas at Austin (McCombs) | 2025 </w:t>
-      </w:r>
-      <w:r>
-        <w:rPr>
-          <w:sz w:val="22"/>
-          <w:szCs w:val="22"/>
-        </w:rPr>
+        <w:t xml:space="preserve">: University of Texas at Austin (McCombs) | 2025 </w:t>
         <w:br/>
       </w:r>
       <w:r>
@@ -1160,43 +1054,14 @@
           <w:sz w:val="22"/>
           <w:szCs w:val="22"/>
         </w:rPr>
-        <w:t xml:space="preserve">Cybersecurity </w:t>
-      </w:r>
-      <w:r>
-        <w:rPr>
-          <w:sz w:val="22"/>
-          <w:szCs w:val="22"/>
-        </w:rPr>
-        <w:t>—</w:t>
-      </w:r>
-      <w:r>
-        <w:rPr>
-          <w:b/>
-          <w:bCs/>
-          <w:sz w:val="22"/>
-          <w:szCs w:val="22"/>
-        </w:rPr>
-        <w:t xml:space="preserve"> </w:t>
-      </w:r>
-      <w:r>
-        <w:rPr>
-          <w:sz w:val="22"/>
-          <w:szCs w:val="22"/>
-        </w:rPr>
-        <w:t>SANS Technology Institute</w:t>
-      </w:r>
-      <w:r>
-        <w:rPr>
-          <w:sz w:val="22"/>
-          <w:szCs w:val="22"/>
-        </w:rPr>
-        <w:t xml:space="preserve"> | 2024 </w:t>
-      </w:r>
-      <w:r>
-        <w:rPr>
-          <w:sz w:val="22"/>
-          <w:szCs w:val="22"/>
-        </w:rPr>
+        <w:t>Cybersecurity</w:t>
+      </w:r>
+      <w:r>
+        <w:rPr>
+          <w:sz w:val="22"/>
+          <w:szCs w:val="22"/>
+        </w:rPr>
+        <w:t xml:space="preserve">: SANS Technology Institute | 2024 </w:t>
         <w:br/>
       </w:r>
       <w:r>
@@ -1206,32 +1071,14 @@
           <w:sz w:val="22"/>
           <w:szCs w:val="22"/>
         </w:rPr>
-        <w:t>B.</w:t>
-      </w:r>
-      <w:r>
-        <w:rPr>
-          <w:b/>
-          <w:bCs/>
-          <w:sz w:val="22"/>
-          <w:szCs w:val="22"/>
-        </w:rPr>
-        <w:t>A.</w:t>
-      </w:r>
-      <w:r>
-        <w:rPr>
-          <w:b/>
-          <w:bCs/>
-          <w:sz w:val="22"/>
-          <w:szCs w:val="22"/>
-        </w:rPr>
-        <w:t>S., Cybersecurity &amp; Information Assurance</w:t>
-      </w:r>
-      <w:r>
-        <w:rPr>
-          <w:sz w:val="22"/>
-          <w:szCs w:val="22"/>
-        </w:rPr>
-        <w:t xml:space="preserve"> — Western Governors University | 2023</w:t>
+        <w:t>B.A.S., Cybersecurity &amp; Information Assurance</w:t>
+      </w:r>
+      <w:r>
+        <w:rPr>
+          <w:sz w:val="22"/>
+          <w:szCs w:val="22"/>
+        </w:rPr>
+        <w:t xml:space="preserve">: Western Governors University | 2023</w:t>
       </w:r>
     </w:p>
     <w:p>
@@ -1271,20 +1118,129 @@
           <w:sz w:val="22"/>
           <w:szCs w:val="22"/>
         </w:rPr>
-        <w:t xml:space="preserve"> GSEC | GCIH | GCIA | SecurityX | CASP+ | CySA+ | PenTest+ | Security+ | SSCP | ITIL SC-200 &amp; SC-300 (In Progress)</w:t>
-      </w:r>
-      <w:r>
-        <w:rPr>
-          <w:sz w:val="22"/>
-          <w:szCs w:val="22"/>
-        </w:rPr>
+        <w:t xml:space="preserve"> GSEC | GCIH | GCIA | SecurityX | CASP+ | CySA+ | PenTest+ | Security+ | Network+ | SSCP </w:t>
         <w:br/>
       </w:r>
       <w:r>
         <w:rPr>
-          <w:sz w:val="22"/>
-          <w:szCs w:val="22"/>
-        </w:rPr>
+          <w:b/>
+          <w:bCs/>
+          <w:sz w:val="22"/>
+          <w:szCs w:val="22"/>
+        </w:rPr>
+        <w:t>AI/ML Engineering:</w:t>
+      </w:r>
+      <w:r>
+        <w:rPr>
+          <w:sz w:val="22"/>
+          <w:szCs w:val="22"/>
+        </w:rPr>
+        <w:t xml:space="preserve"> CAISS | </w:t>
+      </w:r>
+      <w:r>
+        <w:rPr>
+          <w:b/>
+          <w:bCs/>
+          <w:sz w:val="22"/>
+          <w:szCs w:val="22"/>
+        </w:rPr>
+        <w:t>Ready Tensor</w:t>
+      </w:r>
+      <w:r>
+        <w:rPr>
+          <w:sz w:val="22"/>
+          <w:szCs w:val="22"/>
+        </w:rPr>
+        <w:t xml:space="preserve">: Agentic AI, LLM Engineering &amp; Deployment | </w:t>
+      </w:r>
+      <w:r>
+        <w:rPr>
+          <w:b/>
+          <w:bCs/>
+          <w:sz w:val="22"/>
+          <w:szCs w:val="22"/>
+        </w:rPr>
+        <w:t>ProtectAI</w:t>
+      </w:r>
+      <w:r>
+        <w:rPr>
+          <w:sz w:val="22"/>
+          <w:szCs w:val="22"/>
+        </w:rPr>
+        <w:t xml:space="preserve">: MLSecOps | </w:t>
+      </w:r>
+      <w:r>
+        <w:rPr>
+          <w:b/>
+          <w:bCs/>
+          <w:sz w:val="22"/>
+          <w:szCs w:val="22"/>
+        </w:rPr>
+        <w:t>Hugging Face</w:t>
+      </w:r>
+      <w:r>
+        <w:rPr>
+          <w:sz w:val="22"/>
+          <w:szCs w:val="22"/>
+        </w:rPr>
+        <w:t xml:space="preserve">: Agents, MCP | CAIS | </w:t>
+      </w:r>
+      <w:r>
+        <w:rPr>
+          <w:b/>
+          <w:bCs/>
+          <w:sz w:val="22"/>
+          <w:szCs w:val="22"/>
+        </w:rPr>
+        <w:t xml:space="preserve">Practical DevSecOps</w:t>
+      </w:r>
+      <w:r>
+        <w:rPr>
+          <w:sz w:val="22"/>
+          <w:szCs w:val="22"/>
+        </w:rPr>
+        <w:t>: CAISP (In Progress)</w:t>
+      </w:r>
+    </w:p>
+    <w:p>
+      <w:pPr>
+        <w:rPr>
+          <w:sz w:val="22"/>
+          <w:szCs w:val="22"/>
+        </w:rPr>
+      </w:pPr>
+      <w:r>
+        <w:rPr>
+          <w:b/>
+          <w:bCs/>
+          <w:sz w:val="22"/>
+          <w:szCs w:val="22"/>
+        </w:rPr>
+        <w:t>SELECT TECHNOLOGIES</w:t>
+      </w:r>
+    </w:p>
+    <w:p>
+      <w:pPr>
+        <w:rPr>
+          <w:sz w:val="22"/>
+          <w:szCs w:val="22"/>
+        </w:rPr>
+      </w:pPr>
+      <w:r>
+        <w:rPr>
+          <w:b/>
+          <w:bCs/>
+          <w:sz w:val="22"/>
+          <w:szCs w:val="22"/>
+        </w:rPr>
+        <w:t>SOAR</w:t>
+      </w:r>
+      <w:r>
+        <w:rPr>
+          <w:sz w:val="22"/>
+          <w:szCs w:val="22"/>
+        </w:rPr>
+        <w:t xml:space="preserve">: GreyMatter, Swimlane, TheHive. </w:t>
         <w:br/>
       </w:r>
       <w:r>
@@ -1294,127 +1250,102 @@
           <w:sz w:val="22"/>
           <w:szCs w:val="22"/>
         </w:rPr>
-        <w:t>AI/ML Engineering:</w:t>
-      </w:r>
-      <w:r>
-        <w:rPr>
-          <w:sz w:val="22"/>
-          <w:szCs w:val="22"/>
-        </w:rPr>
-        <w:t xml:space="preserve"> CAISS | </w:t>
-      </w:r>
-      <w:r>
-        <w:rPr>
-          <w:b/>
-          <w:bCs/>
-          <w:sz w:val="22"/>
-          <w:szCs w:val="22"/>
-        </w:rPr>
-        <w:t>Ready Tensor</w:t>
-      </w:r>
-      <w:r>
-        <w:rPr>
-          <w:sz w:val="22"/>
-          <w:szCs w:val="22"/>
-        </w:rPr>
-        <w:t xml:space="preserve">: Agentic AI, LLM Engineering &amp; Deployment | </w:t>
-      </w:r>
-      <w:r>
-        <w:rPr>
-          <w:b/>
-          <w:bCs/>
-          <w:sz w:val="22"/>
-          <w:szCs w:val="22"/>
-        </w:rPr>
-        <w:t>ProtectAI</w:t>
-      </w:r>
-      <w:r>
-        <w:rPr>
-          <w:sz w:val="22"/>
-          <w:szCs w:val="22"/>
-        </w:rPr>
-        <w:t xml:space="preserve">: MLSecOps | </w:t>
-      </w:r>
-      <w:r>
-        <w:rPr>
-          <w:b/>
-          <w:bCs/>
-          <w:sz w:val="22"/>
-          <w:szCs w:val="22"/>
-        </w:rPr>
-        <w:t>Hugging Face</w:t>
-      </w:r>
-      <w:r>
-        <w:rPr>
-          <w:sz w:val="22"/>
-          <w:szCs w:val="22"/>
-        </w:rPr>
-        <w:t xml:space="preserve">: Agents, MCP | CAIS | </w:t>
-      </w:r>
-      <w:r>
-        <w:rPr>
-          <w:b/>
-          <w:bCs/>
-          <w:sz w:val="22"/>
-          <w:szCs w:val="22"/>
-        </w:rPr>
-        <w:t>Practical DevSecOps</w:t>
-      </w:r>
-      <w:r>
-        <w:rPr>
-          <w:sz w:val="22"/>
-          <w:szCs w:val="22"/>
-        </w:rPr>
-        <w:t xml:space="preserve">: </w:t>
-      </w:r>
-      <w:r>
-        <w:rPr>
-          <w:sz w:val="22"/>
-          <w:szCs w:val="22"/>
-        </w:rPr>
-        <w:t>CAISP (In Progress)</w:t>
-      </w:r>
-    </w:p>
-    <w:p>
-      <w:pPr>
-        <w:rPr>
-          <w:sz w:val="22"/>
-          <w:szCs w:val="22"/>
-        </w:rPr>
-      </w:pPr>
-      <w:r>
-        <w:rPr>
-          <w:b/>
-          <w:bCs/>
-          <w:sz w:val="22"/>
-          <w:szCs w:val="22"/>
-        </w:rPr>
+        <w:t>SIEM</w:t>
+      </w:r>
+      <w:r>
+        <w:rPr>
+          <w:sz w:val="22"/>
+          <w:szCs w:val="22"/>
+        </w:rPr>
+        <w:t xml:space="preserve">: Sentinel, FortiSIEM, Google SecOps, Wazuh. </w:t>
+        <w:br/>
+      </w:r>
+      <w:r>
+        <w:rPr>
+          <w:b/>
+          <w:bCs/>
+          <w:sz w:val="22"/>
+          <w:szCs w:val="22"/>
+        </w:rPr>
+        <w:t>EDR/XDR</w:t>
+      </w:r>
+      <w:r>
+        <w:rPr>
+          <w:sz w:val="22"/>
+          <w:szCs w:val="22"/>
+        </w:rPr>
+        <w:t xml:space="preserve">: SentinelOne, FortiEDR, Wazuh, Defender </w:t>
+        <w:br/>
+      </w:r>
+      <w:r>
+        <w:rPr>
+          <w:b/>
+          <w:bCs/>
+          <w:sz w:val="22"/>
+          <w:szCs w:val="22"/>
+        </w:rPr>
+        <w:t>Scripting and Querying</w:t>
+      </w:r>
+      <w:r>
+        <w:rPr>
+          <w:sz w:val="22"/>
+          <w:szCs w:val="22"/>
+        </w:rPr>
+        <w:t xml:space="preserve">: Python, PowerShell, Bash, YARA L 2.0, SQL, GIT</w:t>
+        <w:br/>
+      </w:r>
+      <w:r>
+        <w:rPr>
+          <w:b/>
+          <w:bCs/>
+          <w:sz w:val="22"/>
+          <w:szCs w:val="22"/>
+        </w:rPr>
+        <w:t>Cloud</w:t>
+      </w:r>
+      <w:r>
+        <w:rPr>
+          <w:sz w:val="22"/>
+          <w:szCs w:val="22"/>
+        </w:rPr>
+        <w:t xml:space="preserve">: AWS | Azure | GCP </w:t>
+        <w:br/>
+      </w:r>
+      <w:r>
+        <w:rPr>
+          <w:b/>
+          <w:bCs/>
+          <w:sz w:val="22"/>
+          <w:szCs w:val="22"/>
+        </w:rPr>
+        <w:t>AI/ML Engineering</w:t>
+      </w:r>
+      <w:r>
+        <w:rPr>
+          <w:sz w:val="22"/>
+          <w:szCs w:val="22"/>
+        </w:rPr>
+        <w:t xml:space="preserve">: HuggingFace, MCP, Copilot, Claude Code, CodeX, AI Pipeline, AI Security </w:t>
         <w:lastRenderedPageBreak/>
-        <w:t>SELECT TECHNOLOGIES</w:t>
-      </w:r>
-    </w:p>
-    <w:p>
-      <w:pPr>
-        <w:rPr>
-          <w:sz w:val="22"/>
-          <w:szCs w:val="22"/>
-        </w:rPr>
-      </w:pPr>
-      <w:r>
-        <w:rPr>
-          <w:sz w:val="22"/>
-          <w:szCs w:val="22"/>
-        </w:rPr>
-        <w:t>Microsoft Sentinel | Defender XDR | Forti | Wazuh | Splunk | Swimlane SOAR | KQL | Python | REST APIs | Postman | Docker | Git/GitHub | AWS | Azure | GCP | AI/ML Security Engineering</w:t>
-      </w:r>
-    </w:p>
-    <w:p>
-      <w:pPr>
-        <w:rPr>
-          <w:sz w:val="22"/>
-          <w:szCs w:val="22"/>
-        </w:rPr>
-      </w:pPr>
+        <w:t>(Prompt injection, AI guardrails, Security pipelines, Model eval, Plugins, SKILLS, Hooks)</w:t>
+        <w:br/>
+      </w:r>
+      <w:r>
+        <w:rPr>
+          <w:b/>
+          <w:bCs/>
+          <w:sz w:val="22"/>
+          <w:szCs w:val="22"/>
+        </w:rPr>
+        <w:t>Other</w:t>
+      </w:r>
+      <w:r>
+        <w:rPr>
+          <w:sz w:val="22"/>
+          <w:szCs w:val="22"/>
+        </w:rPr>
+        <w:t>: REST APIs, Postman, Docker, Git/GitHub</w:t>
+      </w:r>
     </w:p>
     <w:sectPr>
       <w:pgSz w:w="12240" w:h="15840"/>
@@ -2722,6 +2653,7 @@
   <w:style w:type="character" w:default="1" w:styleId="DefaultParagraphFont">
     <w:name w:val="Default Paragraph Font"/>
     <w:uiPriority w:val="1"/>
+    <w:semiHidden/>
     <w:unhideWhenUsed/>
   </w:style>
   <w:style w:type="table" w:default="1" w:styleId="TableNormal">

</xml_diff>